<commit_message>
Sync scope architecture and policy design sections into four runbooks
Brings the CISA ZTMM, CIS Controls v8, NIST CSF 2.0 and NIST 800-53
Technical Runbooks in line with their Reference Design counterparts,
which gained these two sections in the per-framework repos.

Each runbook now has the full house pattern:
- Suggested scope architecture (scope tree)
- Inventory filters
- Labeling strategy table
- Policy framework (absolute deny, least-privilege allowlist, catch-all)
- Policy workspace lifecycle

Following sections renumbered; Reader's Guide and internal
cross-references updated to match. Runbook relative-link convention
preserved.

DOCX, PDF and HTML exports rebuilt for these four runbooks only, using
the repository's own build helpers so output conventions are unchanged.

Co-authored-by: Cursor <cursoragent@cursor.com>
</commit_message>
<xml_diff>
--- a/CISA-ZeroTrust/CSW-CISA-ZTMM-Technical-Runbook.docx
+++ b/CISA-ZeroTrust/CSW-CISA-ZTMM-Technical-Runbook.docx
@@ -28,7 +28,7 @@
         </w:p>
       </w:sdtContent>
     </w:sdt>
-    <w:bookmarkStart w:id="37" w:name="Xa2d0a7e650180b09eb86ff89de0fed649d9593e"/>
+    <w:bookmarkStart w:id="45" w:name="Xa2d0a7e650180b09eb86ff89de0fed649d9593e"/>
     <w:p>
       <w:pPr>
         <w:pStyle w:val="Heading1"/>
@@ -388,13 +388,19 @@
         <w:t xml:space="preserve"> </w:t>
       </w:r>
       <w:r>
-        <w:t xml:space="preserve">section 6 for a phased deployment plan; section 8 if your team uses a</w:t>
-      </w:r>
-      <w:r>
-        <w:t xml:space="preserve"> </w:t>
-      </w:r>
-      <w:r>
-        <w:t xml:space="preserve">scorecard format.</w:t>
+        <w:t xml:space="preserve">sections 6–7 for the scope tree and the enforcement policy that move</w:t>
+      </w:r>
+      <w:r>
+        <w:t xml:space="preserve"> </w:t>
+      </w:r>
+      <w:r>
+        <w:t xml:space="preserve">the Networks pillar to Advanced; section 8 for a phased deployment</w:t>
+      </w:r>
+      <w:r>
+        <w:t xml:space="preserve"> </w:t>
+      </w:r>
+      <w:r>
+        <w:t xml:space="preserve">plan; section 10 if your team uses a scorecard format.</w:t>
       </w:r>
     </w:p>
     <w:p>
@@ -2875,22 +2881,70 @@
       </w:r>
     </w:p>
     <w:bookmarkEnd w:id="26"/>
-    <w:bookmarkStart w:id="30" w:name="X407e4c7280d618e48fbc21383a90ac00ec38d2a"/>
+    <w:bookmarkStart w:id="30" w:name="Xf5f63a4583574aefa239ce65984f547b1f0faaa"/>
     <w:p>
       <w:pPr>
         <w:pStyle w:val="Heading2"/>
       </w:pPr>
       <w:r>
-        <w:t xml:space="preserve">6. CSW Deployment Phases for ZTMM</w:t>
-      </w:r>
-    </w:p>
-    <w:bookmarkStart w:id="27" w:name="X320850d673eb1862e15d344ae17772c49b29613"/>
+        <w:t xml:space="preserve">6. Scope Architecture for ZTMM</w:t>
+      </w:r>
+    </w:p>
+    <w:p>
+      <w:pPr>
+        <w:pStyle w:val="FirstParagraph"/>
+      </w:pPr>
+      <w:r>
+        <w:t xml:space="preserve">Maturity is claimed per pillar, so the scope tree has to make a pillar</w:t>
+      </w:r>
+      <w:r>
+        <w:t xml:space="preserve"> </w:t>
+      </w:r>
+      <w:r>
+        <w:t xml:space="preserve">claim provable for a named set of workloads. Build the tree before any</w:t>
+      </w:r>
+      <w:r>
+        <w:t xml:space="preserve"> </w:t>
+      </w:r>
+      <w:r>
+        <w:t xml:space="preserve">enforcement work: the Networks and Applications pillars both move from</w:t>
+      </w:r>
+      <w:r>
+        <w:t xml:space="preserve"> </w:t>
+      </w:r>
+      <w:r>
+        <w:t xml:space="preserve">Initial to Advanced on the strength of</w:t>
+      </w:r>
+      <w:r>
+        <w:t xml:space="preserve"> </w:t>
+      </w:r>
+      <w:r>
+        <w:rPr>
+          <w:i/>
+          <w:iCs/>
+        </w:rPr>
+        <w:t xml:space="preserve">which</w:t>
+      </w:r>
+      <w:r>
+        <w:t xml:space="preserve"> </w:t>
+      </w:r>
+      <w:r>
+        <w:t xml:space="preserve">workloads sit inside a</w:t>
+      </w:r>
+      <w:r>
+        <w:t xml:space="preserve"> </w:t>
+      </w:r>
+      <w:r>
+        <w:t xml:space="preserve">deny-by-default boundary, not on the existence of policy in general.</w:t>
+      </w:r>
+    </w:p>
+    <w:bookmarkStart w:id="27" w:name="X717737586e9f4c9c97c685ea294e72a6aa11669"/>
     <w:p>
       <w:pPr>
         <w:pStyle w:val="Heading3"/>
       </w:pPr>
       <w:r>
-        <w:t xml:space="preserve">Phase 1 — Establish Visibility (Traditional → Initial)</w:t>
+        <w:t xml:space="preserve">6.1 Suggested Scope Architecture</w:t>
       </w:r>
     </w:p>
     <w:p>
@@ -2901,7 +2955,7 @@
         <w:rPr>
           <w:rStyle w:val="VerbatimChar"/>
         </w:rPr>
-        <w:t xml:space="preserve">Week 1-2:   Deploy sensors (on-prem + cloud connectors)</w:t>
+        <w:t xml:space="preserve">Root Scope</w:t>
       </w:r>
       <w:r>
         <w:br/>
@@ -2910,7 +2964,7 @@
         <w:rPr>
           <w:rStyle w:val="VerbatimChar"/>
         </w:rPr>
-        <w:t xml:space="preserve">Week 3-4:   Run ADM — generate traffic baseline</w:t>
+        <w:t xml:space="preserve">└── Zero-Trust-Estate</w:t>
       </w:r>
       <w:r>
         <w:br/>
@@ -2919,7 +2973,7 @@
         <w:rPr>
           <w:rStyle w:val="VerbatimChar"/>
         </w:rPr>
-        <w:t xml:space="preserve">Week 4:     Define scope hierarchy</w:t>
+        <w:t xml:space="preserve">    ├── High-Value-Assets                  (HVA register — OMB M-22-09 priority)</w:t>
       </w:r>
       <w:r>
         <w:br/>
@@ -2928,17 +2982,148 @@
         <w:rPr>
           <w:rStyle w:val="VerbatimChar"/>
         </w:rPr>
-        <w:t xml:space="preserve">Week 4:     Enable flow telemetry retention (12 months)</w:t>
+        <w:t xml:space="preserve">    │   ├── Mission-Applications</w:t>
+      </w:r>
+      <w:r>
+        <w:br/>
+      </w:r>
+      <w:r>
+        <w:rPr>
+          <w:rStyle w:val="VerbatimChar"/>
+        </w:rPr>
+        <w:t xml:space="preserve">    │   └── Authoritative-Data-Stores</w:t>
+      </w:r>
+      <w:r>
+        <w:br/>
+      </w:r>
+      <w:r>
+        <w:rPr>
+          <w:rStyle w:val="VerbatimChar"/>
+        </w:rPr>
+        <w:t xml:space="preserve">    ├── Enterprise-Applications</w:t>
+      </w:r>
+      <w:r>
+        <w:br/>
+      </w:r>
+      <w:r>
+        <w:rPr>
+          <w:rStyle w:val="VerbatimChar"/>
+        </w:rPr>
+        <w:t xml:space="preserve">    │   ├── Public-Facing</w:t>
+      </w:r>
+      <w:r>
+        <w:br/>
+      </w:r>
+      <w:r>
+        <w:rPr>
+          <w:rStyle w:val="VerbatimChar"/>
+        </w:rPr>
+        <w:t xml:space="preserve">    │   └── Internal-Facing</w:t>
+      </w:r>
+      <w:r>
+        <w:br/>
+      </w:r>
+      <w:r>
+        <w:rPr>
+          <w:rStyle w:val="VerbatimChar"/>
+        </w:rPr>
+        <w:t xml:space="preserve">    ├── Identity-Infrastructure            (IdP, directory, PKI — Identity pillar edge)</w:t>
+      </w:r>
+      <w:r>
+        <w:br/>
+      </w:r>
+      <w:r>
+        <w:rPr>
+          <w:rStyle w:val="VerbatimChar"/>
+        </w:rPr>
+        <w:t xml:space="preserve">    ├── Security-Services                  (EDR, SIEM, scanners, CSPM)</w:t>
+      </w:r>
+      <w:r>
+        <w:br/>
+      </w:r>
+      <w:r>
+        <w:rPr>
+          <w:rStyle w:val="VerbatimChar"/>
+        </w:rPr>
+        <w:t xml:space="preserve">    ├── Privileged-Access-Paths            (bastions / jump hosts)</w:t>
+      </w:r>
+      <w:r>
+        <w:br/>
+      </w:r>
+      <w:r>
+        <w:rPr>
+          <w:rStyle w:val="VerbatimChar"/>
+        </w:rPr>
+        <w:t xml:space="preserve">    └── Untrusted</w:t>
+      </w:r>
+      <w:r>
+        <w:br/>
+      </w:r>
+      <w:r>
+        <w:rPr>
+          <w:rStyle w:val="VerbatimChar"/>
+        </w:rPr>
+        <w:t xml:space="preserve">        ├── Internet-Edge</w:t>
+      </w:r>
+      <w:r>
+        <w:br/>
+      </w:r>
+      <w:r>
+        <w:rPr>
+          <w:rStyle w:val="VerbatimChar"/>
+        </w:rPr>
+        <w:t xml:space="preserve">        └── Partner-Connectivity</w:t>
+      </w:r>
+    </w:p>
+    <w:p>
+      <w:pPr>
+        <w:pStyle w:val="FirstParagraph"/>
+      </w:pPr>
+      <w:r>
+        <w:t xml:space="preserve">The</w:t>
+      </w:r>
+      <w:r>
+        <w:t xml:space="preserve"> </w:t>
+      </w:r>
+      <w:r>
+        <w:rPr>
+          <w:rStyle w:val="VerbatimChar"/>
+        </w:rPr>
+        <w:t xml:space="preserve">Untrusted</w:t>
+      </w:r>
+      <w:r>
+        <w:t xml:space="preserve"> </w:t>
+      </w:r>
+      <w:r>
+        <w:t xml:space="preserve">branch matters more here than in a compliance-boundary</w:t>
+      </w:r>
+      <w:r>
+        <w:t xml:space="preserve"> </w:t>
+      </w:r>
+      <w:r>
+        <w:t xml:space="preserve">design: ZTMM treats the network as hostile by default, so the tree should</w:t>
+      </w:r>
+      <w:r>
+        <w:t xml:space="preserve"> </w:t>
+      </w:r>
+      <w:r>
+        <w:t xml:space="preserve">name the untrusted side explicitly rather than leave it as the implicit</w:t>
+      </w:r>
+      <w:r>
+        <w:t xml:space="preserve"> </w:t>
+      </w:r>
+      <w:r>
+        <w:t xml:space="preserve">remainder.</w:t>
       </w:r>
     </w:p>
     <w:bookmarkEnd w:id="27"/>
-    <w:bookmarkStart w:id="28" w:name="Xcd581552ac7ae0a426619c48d97ef5610a60dc3"/>
+    <w:bookmarkStart w:id="28" w:name="X06159b7696679acf52ac8c987b833b5abf21194"/>
     <w:p>
       <w:pPr>
         <w:pStyle w:val="Heading3"/>
       </w:pPr>
       <w:r>
-        <w:t xml:space="preserve">Phase 2 — Enforce Least Privilege (Initial → Advanced)</w:t>
+        <w:t xml:space="preserve">6.2 Inventory Filters</w:t>
       </w:r>
     </w:p>
     <w:p>
@@ -2949,7 +3134,7 @@
         <w:rPr>
           <w:rStyle w:val="VerbatimChar"/>
         </w:rPr>
-        <w:t xml:space="preserve">Week 5-6:   Build allowlist policies from ADM</w:t>
+        <w:t xml:space="preserve">Filter: High-Value-Assets</w:t>
       </w:r>
       <w:r>
         <w:br/>
@@ -2958,7 +3143,7 @@
         <w:rPr>
           <w:rStyle w:val="VerbatimChar"/>
         </w:rPr>
-        <w:t xml:space="preserve">Week 7-8:   Simulation mode — validate no false positives</w:t>
+        <w:t xml:space="preserve">  - Tag: hva = true</w:t>
       </w:r>
       <w:r>
         <w:br/>
@@ -2967,7 +3152,7 @@
         <w:rPr>
           <w:rStyle w:val="VerbatimChar"/>
         </w:rPr>
-        <w:t xml:space="preserve">Week 9-10:  Enforcement mode — sensitive scopes first</w:t>
+        <w:t xml:space="preserve">  - Tag: fisma_impact = high | moderate</w:t>
       </w:r>
       <w:r>
         <w:br/>
@@ -2976,73 +3161,484 @@
         <w:rPr>
           <w:rStyle w:val="VerbatimChar"/>
         </w:rPr>
-        <w:t xml:space="preserve">Week 11-12: Encryption enforcement; block non-compliant protocols</w:t>
+        <w:t xml:space="preserve">  - Hostname / application pattern matches the HVA register</w:t>
       </w:r>
       <w:r>
         <w:br/>
       </w:r>
       <w:r>
-        <w:rPr>
-          <w:rStyle w:val="VerbatimChar"/>
-        </w:rPr>
-        <w:t xml:space="preserve">Week 12:    Full alerting and SIEM integration</w:t>
+        <w:br/>
+      </w:r>
+      <w:r>
+        <w:rPr>
+          <w:rStyle w:val="VerbatimChar"/>
+        </w:rPr>
+        <w:t xml:space="preserve">Filter: Authoritative-Data-Stores</w:t>
+      </w:r>
+      <w:r>
+        <w:br/>
+      </w:r>
+      <w:r>
+        <w:rPr>
+          <w:rStyle w:val="VerbatimChar"/>
+        </w:rPr>
+        <w:t xml:space="preserve">  - Tag: data_category = authoritative | sensitive</w:t>
+      </w:r>
+      <w:r>
+        <w:br/>
+      </w:r>
+      <w:r>
+        <w:rPr>
+          <w:rStyle w:val="VerbatimChar"/>
+        </w:rPr>
+        <w:t xml:space="preserve">  - Listening port: 1433, 1521, 3306, 5432, 27017</w:t>
+      </w:r>
+      <w:r>
+        <w:br/>
+      </w:r>
+      <w:r>
+        <w:br/>
+      </w:r>
+      <w:r>
+        <w:rPr>
+          <w:rStyle w:val="VerbatimChar"/>
+        </w:rPr>
+        <w:t xml:space="preserve">Filter: Identity-Infrastructure</w:t>
+      </w:r>
+      <w:r>
+        <w:br/>
+      </w:r>
+      <w:r>
+        <w:rPr>
+          <w:rStyle w:val="VerbatimChar"/>
+        </w:rPr>
+        <w:t xml:space="preserve">  - Listening port: 88, 389, 636, 3268, 1812</w:t>
+      </w:r>
+      <w:r>
+        <w:br/>
+      </w:r>
+      <w:r>
+        <w:rPr>
+          <w:rStyle w:val="VerbatimChar"/>
+        </w:rPr>
+        <w:t xml:space="preserve">  - Tag: application = idp | directory | pki</w:t>
+      </w:r>
+      <w:r>
+        <w:br/>
+      </w:r>
+      <w:r>
+        <w:br/>
+      </w:r>
+      <w:r>
+        <w:rPr>
+          <w:rStyle w:val="VerbatimChar"/>
+        </w:rPr>
+        <w:t xml:space="preserve">Filter: Partner-Connectivity</w:t>
+      </w:r>
+      <w:r>
+        <w:br/>
+      </w:r>
+      <w:r>
+        <w:rPr>
+          <w:rStyle w:val="VerbatimChar"/>
+        </w:rPr>
+        <w:t xml:space="preserve">  - Destination outside agency on-prem and cloud allow-lists</w:t>
+      </w:r>
+      <w:r>
+        <w:br/>
+      </w:r>
+      <w:r>
+        <w:rPr>
+          <w:rStyle w:val="VerbatimChar"/>
+        </w:rPr>
+        <w:t xml:space="preserve">  - Tag: managed_by = partner | contractor</w:t>
       </w:r>
     </w:p>
     <w:bookmarkEnd w:id="28"/>
-    <w:bookmarkStart w:id="29" w:name="X759d3fe46fb04cf24fa67a13951d1e535f197b3"/>
+    <w:bookmarkStart w:id="29" w:name="Xdaad28eb9786cd553c8067b5e009bb212805e9f"/>
     <w:p>
       <w:pPr>
         <w:pStyle w:val="Heading3"/>
       </w:pPr>
       <w:r>
-        <w:t xml:space="preserve">Phase 3 — Continuous Validation (Advanced → Optimal)</w:t>
-      </w:r>
-    </w:p>
-    <w:p>
-      <w:pPr>
-        <w:pStyle w:val="SourceCode"/>
-      </w:pPr>
-      <w:r>
-        <w:rPr>
-          <w:rStyle w:val="VerbatimChar"/>
-        </w:rPr>
-        <w:t xml:space="preserve">Month 4+:   90-day ADM re-run cycles</w:t>
-      </w:r>
-      <w:r>
-        <w:br/>
-      </w:r>
-      <w:r>
-        <w:rPr>
-          <w:rStyle w:val="VerbatimChar"/>
-        </w:rPr>
-        <w:t xml:space="preserve">Month 4+:   Vulnerability-triggered policy review</w:t>
-      </w:r>
-      <w:r>
-        <w:br/>
-      </w:r>
-      <w:r>
-        <w:rPr>
-          <w:rStyle w:val="VerbatimChar"/>
-        </w:rPr>
-        <w:t xml:space="preserve">Month 6+:   API integration with SOAR</w:t>
-      </w:r>
-      <w:r>
-        <w:br/>
-      </w:r>
-      <w:r>
-        <w:rPr>
-          <w:rStyle w:val="VerbatimChar"/>
-        </w:rPr>
-        <w:t xml:space="preserve">Month 6+:   Automated policy tightening on critical CVEs</w:t>
-      </w:r>
-      <w:r>
-        <w:br/>
-      </w:r>
-      <w:r>
-        <w:rPr>
-          <w:rStyle w:val="VerbatimChar"/>
-        </w:rPr>
-        <w:t xml:space="preserve">Ongoing:    Maturity assessment vs ZTMM scorecard</w:t>
+        <w:t xml:space="preserve">6.3 Labeling Strategy</w:t>
+      </w:r>
+    </w:p>
+    <w:tbl>
+      <w:tblPr>
+        <w:tblStyle w:val="Table"/>
+        <w:tblW w:type="auto" w:w="0"/>
+        <w:tblLook w:firstRow="1" w:lastRow="0" w:firstColumn="0" w:lastColumn="0" w:noHBand="0" w:noVBand="0" w:val="0020"/>
+      </w:tblPr>
+      <w:tblGrid>
+        <w:gridCol w:w="2640"/>
+        <w:gridCol w:w="2640"/>
+        <w:gridCol w:w="2640"/>
+      </w:tblGrid>
+      <w:tr>
+        <w:trPr>
+          <w:tblHeader w:val="on"/>
+        </w:trPr>
+        <w:tc>
+          <w:tcPr/>
+          <w:p>
+            <w:pPr>
+              <w:pStyle w:val="Compact"/>
+            </w:pPr>
+            <w:r>
+              <w:t xml:space="preserve">Label key</w:t>
+            </w:r>
+          </w:p>
+        </w:tc>
+        <w:tc>
+          <w:tcPr/>
+          <w:p>
+            <w:pPr>
+              <w:pStyle w:val="Compact"/>
+            </w:pPr>
+            <w:r>
+              <w:t xml:space="preserve">Example values</w:t>
+            </w:r>
+          </w:p>
+        </w:tc>
+        <w:tc>
+          <w:tcPr/>
+          <w:p>
+            <w:pPr>
+              <w:pStyle w:val="Compact"/>
+            </w:pPr>
+            <w:r>
+              <w:t xml:space="preserve">Why it matters for ZTMM</w:t>
+            </w:r>
+          </w:p>
+        </w:tc>
+      </w:tr>
+      <w:tr>
+        <w:tc>
+          <w:tcPr/>
+          <w:p>
+            <w:pPr>
+              <w:pStyle w:val="Compact"/>
+            </w:pPr>
+            <w:r>
+              <w:rPr>
+                <w:rStyle w:val="VerbatimChar"/>
+              </w:rPr>
+              <w:t xml:space="preserve">zt_pillar</w:t>
+            </w:r>
+          </w:p>
+        </w:tc>
+        <w:tc>
+          <w:tcPr/>
+          <w:p>
+            <w:pPr>
+              <w:pStyle w:val="Compact"/>
+            </w:pPr>
+            <w:r>
+              <w:t xml:space="preserve">networks, applications, data, identity, devices</w:t>
+            </w:r>
+          </w:p>
+        </w:tc>
+        <w:tc>
+          <w:tcPr/>
+          <w:p>
+            <w:pPr>
+              <w:pStyle w:val="Compact"/>
+            </w:pPr>
+            <w:r>
+              <w:t xml:space="preserve">Routes each workload's evidence to the right pillar in the section 10 scorecard</w:t>
+            </w:r>
+          </w:p>
+        </w:tc>
+      </w:tr>
+      <w:tr>
+        <w:tc>
+          <w:tcPr/>
+          <w:p>
+            <w:pPr>
+              <w:pStyle w:val="Compact"/>
+            </w:pPr>
+            <w:r>
+              <w:rPr>
+                <w:rStyle w:val="VerbatimChar"/>
+              </w:rPr>
+              <w:t xml:space="preserve">zt_stage</w:t>
+            </w:r>
+          </w:p>
+        </w:tc>
+        <w:tc>
+          <w:tcPr/>
+          <w:p>
+            <w:pPr>
+              <w:pStyle w:val="Compact"/>
+            </w:pPr>
+            <w:r>
+              <w:t xml:space="preserve">traditional, initial, advanced, optimal</w:t>
+            </w:r>
+          </w:p>
+        </w:tc>
+        <w:tc>
+          <w:tcPr/>
+          <w:p>
+            <w:pPr>
+              <w:pStyle w:val="Compact"/>
+            </w:pPr>
+            <w:r>
+              <w:t xml:space="preserve">Records the stage actually claimed per workload, so the scorecard is defensible per-asset rather than per-agency</w:t>
+            </w:r>
+          </w:p>
+        </w:tc>
+      </w:tr>
+      <w:tr>
+        <w:tc>
+          <w:tcPr/>
+          <w:p>
+            <w:pPr>
+              <w:pStyle w:val="Compact"/>
+            </w:pPr>
+            <w:r>
+              <w:rPr>
+                <w:rStyle w:val="VerbatimChar"/>
+              </w:rPr>
+              <w:t xml:space="preserve">hva</w:t>
+            </w:r>
+          </w:p>
+        </w:tc>
+        <w:tc>
+          <w:tcPr/>
+          <w:p>
+            <w:pPr>
+              <w:pStyle w:val="Compact"/>
+            </w:pPr>
+            <w:r>
+              <w:t xml:space="preserve">true, false</w:t>
+            </w:r>
+          </w:p>
+        </w:tc>
+        <w:tc>
+          <w:tcPr/>
+          <w:p>
+            <w:pPr>
+              <w:pStyle w:val="Compact"/>
+            </w:pPr>
+            <w:r>
+              <w:t xml:space="preserve">Sequences Advanced/Optimal work onto OMB M-22-09 high-value assets first</w:t>
+            </w:r>
+          </w:p>
+        </w:tc>
+      </w:tr>
+      <w:tr>
+        <w:tc>
+          <w:tcPr/>
+          <w:p>
+            <w:pPr>
+              <w:pStyle w:val="Compact"/>
+            </w:pPr>
+            <w:r>
+              <w:rPr>
+                <w:rStyle w:val="VerbatimChar"/>
+              </w:rPr>
+              <w:t xml:space="preserve">data_category</w:t>
+            </w:r>
+          </w:p>
+        </w:tc>
+        <w:tc>
+          <w:tcPr/>
+          <w:p>
+            <w:pPr>
+              <w:pStyle w:val="Compact"/>
+            </w:pPr>
+            <w:r>
+              <w:t xml:space="preserve">authoritative, sensitive, internal, public</w:t>
+            </w:r>
+          </w:p>
+        </w:tc>
+        <w:tc>
+          <w:tcPr/>
+          <w:p>
+            <w:pPr>
+              <w:pStyle w:val="Compact"/>
+            </w:pPr>
+            <w:r>
+              <w:t xml:space="preserve">Data pillar isolation and plaintext-flow findings</w:t>
+            </w:r>
+          </w:p>
+        </w:tc>
+      </w:tr>
+      <w:tr>
+        <w:tc>
+          <w:tcPr/>
+          <w:p>
+            <w:pPr>
+              <w:pStyle w:val="Compact"/>
+            </w:pPr>
+            <w:r>
+              <w:rPr>
+                <w:rStyle w:val="VerbatimChar"/>
+              </w:rPr>
+              <w:t xml:space="preserve">fisma_impact</w:t>
+            </w:r>
+          </w:p>
+        </w:tc>
+        <w:tc>
+          <w:tcPr/>
+          <w:p>
+            <w:pPr>
+              <w:pStyle w:val="Compact"/>
+            </w:pPr>
+            <w:r>
+              <w:t xml:space="preserve">high, moderate, low</w:t>
+            </w:r>
+          </w:p>
+        </w:tc>
+        <w:tc>
+          <w:tcPr/>
+          <w:p>
+            <w:pPr>
+              <w:pStyle w:val="Compact"/>
+            </w:pPr>
+            <w:r>
+              <w:t xml:space="preserve">Aligns enforcement stringency to the FIPS 199 categorisation</w:t>
+            </w:r>
+          </w:p>
+        </w:tc>
+      </w:tr>
+      <w:tr>
+        <w:tc>
+          <w:tcPr/>
+          <w:p>
+            <w:pPr>
+              <w:pStyle w:val="Compact"/>
+            </w:pPr>
+            <w:r>
+              <w:rPr>
+                <w:rStyle w:val="VerbatimChar"/>
+              </w:rPr>
+              <w:t xml:space="preserve">application</w:t>
+            </w:r>
+          </w:p>
+        </w:tc>
+        <w:tc>
+          <w:tcPr/>
+          <w:p>
+            <w:pPr>
+              <w:pStyle w:val="Compact"/>
+            </w:pPr>
+          </w:p>
+        </w:tc>
+        <w:tc>
+          <w:tcPr/>
+          <w:p>
+            <w:pPr>
+              <w:pStyle w:val="Compact"/>
+            </w:pPr>
+            <w:r>
+              <w:t xml:space="preserve">Connects workloads to the systems named in the ZTMM self-assessment</w:t>
+            </w:r>
+          </w:p>
+        </w:tc>
+      </w:tr>
+      <w:tr>
+        <w:tc>
+          <w:tcPr/>
+          <w:p>
+            <w:pPr>
+              <w:pStyle w:val="Compact"/>
+            </w:pPr>
+            <w:r>
+              <w:rPr>
+                <w:rStyle w:val="VerbatimChar"/>
+              </w:rPr>
+              <w:t xml:space="preserve">owner</w:t>
+            </w:r>
+          </w:p>
+        </w:tc>
+        <w:tc>
+          <w:tcPr/>
+          <w:p>
+            <w:pPr>
+              <w:pStyle w:val="Compact"/>
+            </w:pPr>
+          </w:p>
+        </w:tc>
+        <w:tc>
+          <w:tcPr/>
+          <w:p>
+            <w:pPr>
+              <w:pStyle w:val="Compact"/>
+            </w:pPr>
+            <w:r>
+              <w:t xml:space="preserve">Accountability</w:t>
+            </w:r>
+          </w:p>
+        </w:tc>
+      </w:tr>
+      <w:tr>
+        <w:tc>
+          <w:tcPr/>
+          <w:p>
+            <w:pPr>
+              <w:pStyle w:val="Compact"/>
+            </w:pPr>
+            <w:r>
+              <w:rPr>
+                <w:rStyle w:val="VerbatimChar"/>
+              </w:rPr>
+              <w:t xml:space="preserve">compliance</w:t>
+            </w:r>
+          </w:p>
+        </w:tc>
+        <w:tc>
+          <w:tcPr/>
+          <w:p>
+            <w:pPr>
+              <w:pStyle w:val="Compact"/>
+            </w:pPr>
+            <w:r>
+              <w:t xml:space="preserve">cisa-ztmm</w:t>
+            </w:r>
+          </w:p>
+        </w:tc>
+        <w:tc>
+          <w:tcPr/>
+          <w:p>
+            <w:pPr>
+              <w:pStyle w:val="Compact"/>
+            </w:pPr>
+            <w:r>
+              <w:t xml:space="preserve">Filters CSW evidence to the ZTMM assessment boundary</w:t>
+            </w:r>
+          </w:p>
+        </w:tc>
+      </w:tr>
+    </w:tbl>
+    <w:p>
+      <w:pPr>
+        <w:pStyle w:val="BodyText"/>
+      </w:pPr>
+      <w:r>
+        <w:rPr>
+          <w:rStyle w:val="VerbatimChar"/>
+        </w:rPr>
+        <w:t xml:space="preserve">zt_stage</w:t>
+      </w:r>
+      <w:r>
+        <w:t xml:space="preserve"> </w:t>
+      </w:r>
+      <w:r>
+        <w:t xml:space="preserve">is the label that makes quarterly OMB M-22-09 reporting cheap.</w:t>
+      </w:r>
+      <w:r>
+        <w:t xml:space="preserve"> </w:t>
+      </w:r>
+      <w:r>
+        <w:t xml:space="preserve">Without it, every reporting cycle restates the agency's maturity from</w:t>
+      </w:r>
+      <w:r>
+        <w:t xml:space="preserve"> </w:t>
+      </w:r>
+      <w:r>
+        <w:t xml:space="preserve">memory; with it, the stage claim is a queryable property of the inventory.</w:t>
       </w:r>
     </w:p>
     <w:p>
@@ -3054,13 +3650,246 @@
     </w:p>
     <w:bookmarkEnd w:id="29"/>
     <w:bookmarkEnd w:id="30"/>
-    <w:bookmarkStart w:id="31" w:name="Xf1852d03833c5db17075c8f8055863e59f19df0"/>
+    <w:bookmarkStart w:id="34" w:name="Xcc858178ef319e21a576666bc8e74a26eaee4be"/>
     <w:p>
       <w:pPr>
         <w:pStyle w:val="Heading2"/>
       </w:pPr>
       <w:r>
-        <w:t xml:space="preserve">7. ZTMM Assessment Evidence Package</w:t>
+        <w:t xml:space="preserve">7. Policy Design — Networks &amp; Workloads Enforcement</w:t>
+      </w:r>
+    </w:p>
+    <w:bookmarkStart w:id="31" w:name="Xc76ec4c3eb3219f92b4d7558f949df8d7e6fb36"/>
+    <w:p>
+      <w:pPr>
+        <w:pStyle w:val="Heading3"/>
+      </w:pPr>
+      <w:r>
+        <w:t xml:space="preserve">7.1 ZTMM-Aligned Policy Framework</w:t>
+      </w:r>
+    </w:p>
+    <w:p>
+      <w:pPr>
+        <w:pStyle w:val="FirstParagraph"/>
+      </w:pPr>
+      <w:r>
+        <w:rPr>
+          <w:b/>
+          <w:bCs/>
+        </w:rPr>
+        <w:t xml:space="preserve">Absolute policies:</w:t>
+      </w:r>
+    </w:p>
+    <w:p>
+      <w:pPr>
+        <w:pStyle w:val="SourceCode"/>
+      </w:pPr>
+      <w:r>
+        <w:rPr>
+          <w:rStyle w:val="VerbatimChar"/>
+        </w:rPr>
+        <w:t xml:space="preserve">DENY  Any                        → High-Value-Assets           (default deny inbound)</w:t>
+      </w:r>
+      <w:r>
+        <w:br/>
+      </w:r>
+      <w:r>
+        <w:rPr>
+          <w:rStyle w:val="VerbatimChar"/>
+        </w:rPr>
+        <w:t xml:space="preserve">DENY  High-Value-Assets          → Internet                    (no direct internet egress from HVAs)</w:t>
+      </w:r>
+      <w:r>
+        <w:br/>
+      </w:r>
+      <w:r>
+        <w:rPr>
+          <w:rStyle w:val="VerbatimChar"/>
+        </w:rPr>
+        <w:t xml:space="preserve">DENY  Untrusted                  → Enterprise-Applications     (no direct untrusted-to-workload path)</w:t>
+      </w:r>
+      <w:r>
+        <w:br/>
+      </w:r>
+      <w:r>
+        <w:rPr>
+          <w:rStyle w:val="VerbatimChar"/>
+        </w:rPr>
+        <w:t xml:space="preserve">DENY  Enterprise-Applications    → Enterprise-Applications     (no implicit east-west inside the tier)</w:t>
+      </w:r>
+    </w:p>
+    <w:p>
+      <w:pPr>
+        <w:pStyle w:val="FirstParagraph"/>
+      </w:pPr>
+      <w:r>
+        <w:t xml:space="preserve">The fourth rule is the one that separates Initial from Advanced on the</w:t>
+      </w:r>
+      <w:r>
+        <w:t xml:space="preserve"> </w:t>
+      </w:r>
+      <w:r>
+        <w:t xml:space="preserve">Networks pillar. Perimeter-shaped policy denies north-south and leaves</w:t>
+      </w:r>
+      <w:r>
+        <w:t xml:space="preserve"> </w:t>
+      </w:r>
+      <w:r>
+        <w:t xml:space="preserve">east-west implicit; ZTMM Advanced expects the inverse.</w:t>
+      </w:r>
+    </w:p>
+    <w:p>
+      <w:pPr>
+        <w:pStyle w:val="BodyText"/>
+      </w:pPr>
+      <w:r>
+        <w:rPr>
+          <w:b/>
+          <w:bCs/>
+        </w:rPr>
+        <w:t xml:space="preserve">Allowlist policies (least privilege):</w:t>
+      </w:r>
+    </w:p>
+    <w:p>
+      <w:pPr>
+        <w:pStyle w:val="SourceCode"/>
+      </w:pPr>
+      <w:r>
+        <w:rPr>
+          <w:rStyle w:val="VerbatimChar"/>
+        </w:rPr>
+        <w:t xml:space="preserve">ALLOW Internet-Edge              → Public-Facing               tcp/443</w:t>
+      </w:r>
+      <w:r>
+        <w:br/>
+      </w:r>
+      <w:r>
+        <w:rPr>
+          <w:rStyle w:val="VerbatimChar"/>
+        </w:rPr>
+        <w:t xml:space="preserve">ALLOW Public-Facing              → Internal-Facing             tcp/443</w:t>
+      </w:r>
+      <w:r>
+        <w:br/>
+      </w:r>
+      <w:r>
+        <w:rPr>
+          <w:rStyle w:val="VerbatimChar"/>
+        </w:rPr>
+        <w:t xml:space="preserve">ALLOW Internal-Facing            → Authoritative-Data-Stores   tcp/&lt;db-port-tls&gt;</w:t>
+      </w:r>
+      <w:r>
+        <w:br/>
+      </w:r>
+      <w:r>
+        <w:rPr>
+          <w:rStyle w:val="VerbatimChar"/>
+        </w:rPr>
+        <w:t xml:space="preserve">ALLOW Mission-Applications       → Identity-Infrastructure     tcp/636, tcp/88</w:t>
+      </w:r>
+      <w:r>
+        <w:br/>
+      </w:r>
+      <w:r>
+        <w:rPr>
+          <w:rStyle w:val="VerbatimChar"/>
+        </w:rPr>
+        <w:t xml:space="preserve">ALLOW Privileged-Access-Paths    → High-Value-Assets           tcp/22, tcp/3389</w:t>
+      </w:r>
+      <w:r>
+        <w:br/>
+      </w:r>
+      <w:r>
+        <w:rPr>
+          <w:rStyle w:val="VerbatimChar"/>
+        </w:rPr>
+        <w:t xml:space="preserve">ALLOW Zero-Trust-Estate          → Security-Services           tcp/443</w:t>
+      </w:r>
+    </w:p>
+    <w:p>
+      <w:pPr>
+        <w:pStyle w:val="FirstParagraph"/>
+      </w:pPr>
+      <w:r>
+        <w:rPr>
+          <w:b/>
+          <w:bCs/>
+        </w:rPr>
+        <w:t xml:space="preserve">Catch-all:</w:t>
+      </w:r>
+    </w:p>
+    <w:p>
+      <w:pPr>
+        <w:pStyle w:val="SourceCode"/>
+      </w:pPr>
+      <w:r>
+        <w:rPr>
+          <w:rStyle w:val="VerbatimChar"/>
+        </w:rPr>
+        <w:t xml:space="preserve">LOG   Any                        → High-Value-Assets           (unmatched inbound)</w:t>
+      </w:r>
+      <w:r>
+        <w:br/>
+      </w:r>
+      <w:r>
+        <w:rPr>
+          <w:rStyle w:val="VerbatimChar"/>
+        </w:rPr>
+        <w:t xml:space="preserve">LOG   High-Value-Assets          → Any                         (unmatched outbound)</w:t>
+      </w:r>
+      <w:r>
+        <w:br/>
+      </w:r>
+      <w:r>
+        <w:rPr>
+          <w:rStyle w:val="VerbatimChar"/>
+        </w:rPr>
+        <w:t xml:space="preserve">LOG   Zero-Trust-Estate          → Any                         (plaintext: tcp/80, tcp/21, tcp/23, tcp/389, udp/161)</w:t>
+      </w:r>
+    </w:p>
+    <w:p>
+      <w:pPr>
+        <w:pStyle w:val="FirstParagraph"/>
+      </w:pPr>
+      <w:r>
+        <w:t xml:space="preserve">The plaintext catch-all is the detection input for the Networks pillar</w:t>
+      </w:r>
+      <w:r>
+        <w:t xml:space="preserve"> </w:t>
+      </w:r>
+      <w:r>
+        <w:t xml:space="preserve">encryption expectation. Treat it as a finding generator first; convert</w:t>
+      </w:r>
+      <w:r>
+        <w:t xml:space="preserve"> </w:t>
+      </w:r>
+      <w:r>
+        <w:t xml:space="preserve">those rows to</w:t>
+      </w:r>
+      <w:r>
+        <w:t xml:space="preserve"> </w:t>
+      </w:r>
+      <w:r>
+        <w:rPr>
+          <w:rStyle w:val="VerbatimChar"/>
+        </w:rPr>
+        <w:t xml:space="preserve">DENY</w:t>
+      </w:r>
+      <w:r>
+        <w:t xml:space="preserve"> </w:t>
+      </w:r>
+      <w:r>
+        <w:t xml:space="preserve">only once the application owners have a TLS path.</w:t>
+      </w:r>
+    </w:p>
+    <w:bookmarkEnd w:id="31"/>
+    <w:bookmarkStart w:id="32" w:name="Xbb6a1576072169b8f2f742f58684e6bb33c2bd5"/>
+    <w:p>
+      <w:pPr>
+        <w:pStyle w:val="Heading3"/>
+      </w:pPr>
+      <w:r>
+        <w:t xml:space="preserve">7.2 Policy Workspace Lifecycle</w:t>
       </w:r>
     </w:p>
     <w:tbl>
@@ -3086,40 +3915,40 @@
               <w:pStyle w:val="Compact"/>
             </w:pPr>
             <w:r>
-              <w:t xml:space="preserve">Evidence Item</w:t>
-            </w:r>
-          </w:p>
-        </w:tc>
-        <w:tc>
-          <w:tcPr/>
-          <w:p>
-            <w:pPr>
-              <w:pStyle w:val="Compact"/>
-            </w:pPr>
-            <w:r>
-              <w:t xml:space="preserve">CSW Source</w:t>
-            </w:r>
-          </w:p>
-        </w:tc>
-        <w:tc>
-          <w:tcPr/>
-          <w:p>
-            <w:pPr>
-              <w:pStyle w:val="Compact"/>
-            </w:pPr>
-            <w:r>
-              <w:t xml:space="preserve">ZTMM Pillar</w:t>
-            </w:r>
-          </w:p>
-        </w:tc>
-        <w:tc>
-          <w:tcPr/>
-          <w:p>
-            <w:pPr>
-              <w:pStyle w:val="Compact"/>
-            </w:pPr>
-            <w:r>
-              <w:t xml:space="preserve">Maturity Stage</w:t>
+              <w:t xml:space="preserve">Phase</w:t>
+            </w:r>
+          </w:p>
+        </w:tc>
+        <w:tc>
+          <w:tcPr/>
+          <w:p>
+            <w:pPr>
+              <w:pStyle w:val="Compact"/>
+            </w:pPr>
+            <w:r>
+              <w:t xml:space="preserve">Mode</w:t>
+            </w:r>
+          </w:p>
+        </w:tc>
+        <w:tc>
+          <w:tcPr/>
+          <w:p>
+            <w:pPr>
+              <w:pStyle w:val="Compact"/>
+            </w:pPr>
+            <w:r>
+              <w:t xml:space="preserve">Duration</w:t>
+            </w:r>
+          </w:p>
+        </w:tc>
+        <w:tc>
+          <w:tcPr/>
+          <w:p>
+            <w:pPr>
+              <w:pStyle w:val="Compact"/>
+            </w:pPr>
+            <w:r>
+              <w:t xml:space="preserve">Purpose</w:t>
             </w:r>
           </w:p>
         </w:tc>
@@ -3132,40 +3961,40 @@
               <w:pStyle w:val="Compact"/>
             </w:pPr>
             <w:r>
-              <w:t xml:space="preserve">ADM traffic baseline</w:t>
-            </w:r>
-          </w:p>
-        </w:tc>
-        <w:tc>
-          <w:tcPr/>
-          <w:p>
-            <w:pPr>
-              <w:pStyle w:val="Compact"/>
-            </w:pPr>
-            <w:r>
-              <w:t xml:space="preserve">Investigate → ADM</w:t>
-            </w:r>
-          </w:p>
-        </w:tc>
-        <w:tc>
-          <w:tcPr/>
-          <w:p>
-            <w:pPr>
-              <w:pStyle w:val="Compact"/>
-            </w:pPr>
-            <w:r>
-              <w:t xml:space="preserve">Networks, Apps</w:t>
-            </w:r>
-          </w:p>
-        </w:tc>
-        <w:tc>
-          <w:tcPr/>
-          <w:p>
-            <w:pPr>
-              <w:pStyle w:val="Compact"/>
-            </w:pPr>
-            <w:r>
-              <w:t xml:space="preserve">Initial</w:t>
+              <w:t xml:space="preserve">1</w:t>
+            </w:r>
+          </w:p>
+        </w:tc>
+        <w:tc>
+          <w:tcPr/>
+          <w:p>
+            <w:pPr>
+              <w:pStyle w:val="Compact"/>
+            </w:pPr>
+            <w:r>
+              <w:t xml:space="preserve">Simulation</w:t>
+            </w:r>
+          </w:p>
+        </w:tc>
+        <w:tc>
+          <w:tcPr/>
+          <w:p>
+            <w:pPr>
+              <w:pStyle w:val="Compact"/>
+            </w:pPr>
+            <w:r>
+              <w:t xml:space="preserve">2 weeks</w:t>
+            </w:r>
+          </w:p>
+        </w:tc>
+        <w:tc>
+          <w:tcPr/>
+          <w:p>
+            <w:pPr>
+              <w:pStyle w:val="Compact"/>
+            </w:pPr>
+            <w:r>
+              <w:t xml:space="preserve">Validate the candidate policy</w:t>
             </w:r>
           </w:p>
         </w:tc>
@@ -3178,40 +4007,40 @@
               <w:pStyle w:val="Compact"/>
             </w:pPr>
             <w:r>
-              <w:t xml:space="preserve">Enforcement policy export</w:t>
-            </w:r>
-          </w:p>
-        </w:tc>
-        <w:tc>
-          <w:tcPr/>
-          <w:p>
-            <w:pPr>
-              <w:pStyle w:val="Compact"/>
-            </w:pPr>
-            <w:r>
-              <w:t xml:space="preserve">Defend → Policy Workspaces</w:t>
-            </w:r>
-          </w:p>
-        </w:tc>
-        <w:tc>
-          <w:tcPr/>
-          <w:p>
-            <w:pPr>
-              <w:pStyle w:val="Compact"/>
-            </w:pPr>
-            <w:r>
-              <w:t xml:space="preserve">Networks, Apps</w:t>
-            </w:r>
-          </w:p>
-        </w:tc>
-        <w:tc>
-          <w:tcPr/>
-          <w:p>
-            <w:pPr>
-              <w:pStyle w:val="Compact"/>
-            </w:pPr>
-            <w:r>
-              <w:t xml:space="preserve">Advanced</w:t>
+              <w:t xml:space="preserve">2</w:t>
+            </w:r>
+          </w:p>
+        </w:tc>
+        <w:tc>
+          <w:tcPr/>
+          <w:p>
+            <w:pPr>
+              <w:pStyle w:val="Compact"/>
+            </w:pPr>
+            <w:r>
+              <w:t xml:space="preserve">Enforcement (high-confidence rules only)</w:t>
+            </w:r>
+          </w:p>
+        </w:tc>
+        <w:tc>
+          <w:tcPr/>
+          <w:p>
+            <w:pPr>
+              <w:pStyle w:val="Compact"/>
+            </w:pPr>
+            <w:r>
+              <w:t xml:space="preserve">1 week</w:t>
+            </w:r>
+          </w:p>
+        </w:tc>
+        <w:tc>
+          <w:tcPr/>
+          <w:p>
+            <w:pPr>
+              <w:pStyle w:val="Compact"/>
+            </w:pPr>
+            <w:r>
+              <w:t xml:space="preserve">Enforce obvious deny rules</w:t>
             </w:r>
           </w:p>
         </w:tc>
@@ -3224,40 +4053,114 @@
               <w:pStyle w:val="Compact"/>
             </w:pPr>
             <w:r>
-              <w:t xml:space="preserve">Encryption compliance report</w:t>
-            </w:r>
-          </w:p>
-        </w:tc>
-        <w:tc>
-          <w:tcPr/>
-          <w:p>
-            <w:pPr>
-              <w:pStyle w:val="Compact"/>
-            </w:pPr>
-            <w:r>
-              <w:t xml:space="preserve">Flow Search (protocol filter)</w:t>
-            </w:r>
-          </w:p>
-        </w:tc>
-        <w:tc>
-          <w:tcPr/>
-          <w:p>
-            <w:pPr>
-              <w:pStyle w:val="Compact"/>
-            </w:pPr>
-            <w:r>
-              <w:t xml:space="preserve">Networks, Data</w:t>
-            </w:r>
-          </w:p>
-        </w:tc>
-        <w:tc>
-          <w:tcPr/>
-          <w:p>
-            <w:pPr>
-              <w:pStyle w:val="Compact"/>
-            </w:pPr>
-            <w:r>
-              <w:t xml:space="preserve">Advanced</w:t>
+              <w:t xml:space="preserve">3</w:t>
+            </w:r>
+          </w:p>
+        </w:tc>
+        <w:tc>
+          <w:tcPr/>
+          <w:p>
+            <w:pPr>
+              <w:pStyle w:val="Compact"/>
+            </w:pPr>
+            <w:r>
+              <w:t xml:space="preserve">Full Enforcement</w:t>
+            </w:r>
+          </w:p>
+        </w:tc>
+        <w:tc>
+          <w:tcPr/>
+          <w:p>
+            <w:pPr>
+              <w:pStyle w:val="Compact"/>
+            </w:pPr>
+            <w:r>
+              <w:t xml:space="preserve">Ongoing</w:t>
+            </w:r>
+          </w:p>
+        </w:tc>
+        <w:tc>
+          <w:tcPr/>
+          <w:p>
+            <w:pPr>
+              <w:pStyle w:val="Compact"/>
+            </w:pPr>
+            <w:r>
+              <w:t xml:space="preserve">Workload allowlist enforced; monthly exception review</w:t>
+            </w:r>
+          </w:p>
+        </w:tc>
+      </w:tr>
+    </w:tbl>
+    <w:bookmarkEnd w:id="32"/>
+    <w:bookmarkStart w:id="33" w:name="X4034990315a7dee9a7597995fc98c388461e5fc"/>
+    <w:p>
+      <w:pPr>
+        <w:pStyle w:val="Heading3"/>
+      </w:pPr>
+      <w:r>
+        <w:t xml:space="preserve">7.3 Enforcement State to Networks Pillar Stage</w:t>
+      </w:r>
+    </w:p>
+    <w:p>
+      <w:pPr>
+        <w:pStyle w:val="FirstParagraph"/>
+      </w:pPr>
+      <w:r>
+        <w:t xml:space="preserve">The maturity claim should follow the workspace state, not the project plan.</w:t>
+      </w:r>
+      <w:r>
+        <w:t xml:space="preserve"> </w:t>
+      </w:r>
+      <w:r>
+        <w:t xml:space="preserve">Use this to keep the section 10 scorecard honest:</w:t>
+      </w:r>
+    </w:p>
+    <w:tbl>
+      <w:tblPr>
+        <w:tblStyle w:val="Table"/>
+        <w:tblW w:type="auto" w:w="0"/>
+        <w:tblLook w:firstRow="1" w:lastRow="0" w:firstColumn="0" w:lastColumn="0" w:noHBand="0" w:noVBand="0" w:val="0020"/>
+      </w:tblPr>
+      <w:tblGrid>
+        <w:gridCol w:w="2640"/>
+        <w:gridCol w:w="2640"/>
+        <w:gridCol w:w="2640"/>
+      </w:tblGrid>
+      <w:tr>
+        <w:trPr>
+          <w:tblHeader w:val="on"/>
+        </w:trPr>
+        <w:tc>
+          <w:tcPr/>
+          <w:p>
+            <w:pPr>
+              <w:pStyle w:val="Compact"/>
+            </w:pPr>
+            <w:r>
+              <w:t xml:space="preserve">Workspace state</w:t>
+            </w:r>
+          </w:p>
+        </w:tc>
+        <w:tc>
+          <w:tcPr/>
+          <w:p>
+            <w:pPr>
+              <w:pStyle w:val="Compact"/>
+            </w:pPr>
+            <w:r>
+              <w:t xml:space="preserve">Networks pillar stage</w:t>
+            </w:r>
+          </w:p>
+        </w:tc>
+        <w:tc>
+          <w:tcPr/>
+          <w:p>
+            <w:pPr>
+              <w:pStyle w:val="Compact"/>
+            </w:pPr>
+            <w:r>
+              <w:t xml:space="preserve">Evidence to retain</w:t>
             </w:r>
           </w:p>
         </w:tc>
@@ -3270,40 +4173,29 @@
               <w:pStyle w:val="Compact"/>
             </w:pPr>
             <w:r>
-              <w:t xml:space="preserve">Anomaly detection log</w:t>
-            </w:r>
-          </w:p>
-        </w:tc>
-        <w:tc>
-          <w:tcPr/>
-          <w:p>
-            <w:pPr>
-              <w:pStyle w:val="Compact"/>
-            </w:pPr>
-            <w:r>
-              <w:t xml:space="preserve">Alerts → Dashboard</w:t>
-            </w:r>
-          </w:p>
-        </w:tc>
-        <w:tc>
-          <w:tcPr/>
-          <w:p>
-            <w:pPr>
-              <w:pStyle w:val="Compact"/>
-            </w:pPr>
-            <w:r>
-              <w:t xml:space="preserve">Networks</w:t>
-            </w:r>
-          </w:p>
-        </w:tc>
-        <w:tc>
-          <w:tcPr/>
-          <w:p>
-            <w:pPr>
-              <w:pStyle w:val="Compact"/>
-            </w:pPr>
-            <w:r>
-              <w:t xml:space="preserve">Advanced</w:t>
+              <w:t xml:space="preserve">ADM running, no workspace</w:t>
+            </w:r>
+          </w:p>
+        </w:tc>
+        <w:tc>
+          <w:tcPr/>
+          <w:p>
+            <w:pPr>
+              <w:pStyle w:val="Compact"/>
+            </w:pPr>
+            <w:r>
+              <w:t xml:space="preserve">Traditional</w:t>
+            </w:r>
+          </w:p>
+        </w:tc>
+        <w:tc>
+          <w:tcPr/>
+          <w:p>
+            <w:pPr>
+              <w:pStyle w:val="Compact"/>
+            </w:pPr>
+            <w:r>
+              <w:t xml:space="preserve">ADM baseline export</w:t>
             </w:r>
           </w:p>
         </w:tc>
@@ -3316,40 +4208,29 @@
               <w:pStyle w:val="Compact"/>
             </w:pPr>
             <w:r>
-              <w:t xml:space="preserve">Vulnerability report</w:t>
-            </w:r>
-          </w:p>
-        </w:tc>
-        <w:tc>
-          <w:tcPr/>
-          <w:p>
-            <w:pPr>
-              <w:pStyle w:val="Compact"/>
-            </w:pPr>
-            <w:r>
-              <w:t xml:space="preserve">Investigate → Vulnerability</w:t>
-            </w:r>
-          </w:p>
-        </w:tc>
-        <w:tc>
-          <w:tcPr/>
-          <w:p>
-            <w:pPr>
-              <w:pStyle w:val="Compact"/>
-            </w:pPr>
-            <w:r>
-              <w:t xml:space="preserve">Apps</w:t>
-            </w:r>
-          </w:p>
-        </w:tc>
-        <w:tc>
-          <w:tcPr/>
-          <w:p>
-            <w:pPr>
-              <w:pStyle w:val="Compact"/>
-            </w:pPr>
-            <w:r>
-              <w:t xml:space="preserve">Advanced</w:t>
+              <w:t xml:space="preserve">Workspace in Simulation</w:t>
+            </w:r>
+          </w:p>
+        </w:tc>
+        <w:tc>
+          <w:tcPr/>
+          <w:p>
+            <w:pPr>
+              <w:pStyle w:val="Compact"/>
+            </w:pPr>
+            <w:r>
+              <w:t xml:space="preserve">Initial</w:t>
+            </w:r>
+          </w:p>
+        </w:tc>
+        <w:tc>
+          <w:tcPr/>
+          <w:p>
+            <w:pPr>
+              <w:pStyle w:val="Compact"/>
+            </w:pPr>
+            <w:r>
+              <w:t xml:space="preserve">Policy export + simulation report</w:t>
             </w:r>
           </w:p>
         </w:tc>
@@ -3362,40 +4243,29 @@
               <w:pStyle w:val="Compact"/>
             </w:pPr>
             <w:r>
-              <w:t xml:space="preserve">Continuous ADM comparison</w:t>
-            </w:r>
-          </w:p>
-        </w:tc>
-        <w:tc>
-          <w:tcPr/>
-          <w:p>
-            <w:pPr>
-              <w:pStyle w:val="Compact"/>
-            </w:pPr>
-            <w:r>
-              <w:t xml:space="preserve">ADM re-run vs baseline</w:t>
-            </w:r>
-          </w:p>
-        </w:tc>
-        <w:tc>
-          <w:tcPr/>
-          <w:p>
-            <w:pPr>
-              <w:pStyle w:val="Compact"/>
-            </w:pPr>
-            <w:r>
-              <w:t xml:space="preserve">Networks, Apps</w:t>
-            </w:r>
-          </w:p>
-        </w:tc>
-        <w:tc>
-          <w:tcPr/>
-          <w:p>
-            <w:pPr>
-              <w:pStyle w:val="Compact"/>
-            </w:pPr>
-            <w:r>
-              <w:t xml:space="preserve">Optimal</w:t>
+              <w:t xml:space="preserve">Enforcement on HVA scopes, deny-by-default inbound</w:t>
+            </w:r>
+          </w:p>
+        </w:tc>
+        <w:tc>
+          <w:tcPr/>
+          <w:p>
+            <w:pPr>
+              <w:pStyle w:val="Compact"/>
+            </w:pPr>
+            <w:r>
+              <w:t xml:space="preserve">Advanced</w:t>
+            </w:r>
+          </w:p>
+        </w:tc>
+        <w:tc>
+          <w:tcPr/>
+          <w:p>
+            <w:pPr>
+              <w:pStyle w:val="Compact"/>
+            </w:pPr>
+            <w:r>
+              <w:t xml:space="preserve">Policy export + Denied Connections sample</w:t>
             </w:r>
           </w:p>
         </w:tc>
@@ -3408,29 +4278,7 @@
               <w:pStyle w:val="Compact"/>
             </w:pPr>
             <w:r>
-              <w:t xml:space="preserve">API policy automation evidence</w:t>
-            </w:r>
-          </w:p>
-        </w:tc>
-        <w:tc>
-          <w:tcPr/>
-          <w:p>
-            <w:pPr>
-              <w:pStyle w:val="Compact"/>
-            </w:pPr>
-            <w:r>
-              <w:t xml:space="preserve">CSW API audit log</w:t>
-            </w:r>
-          </w:p>
-        </w:tc>
-        <w:tc>
-          <w:tcPr/>
-          <w:p>
-            <w:pPr>
-              <w:pStyle w:val="Compact"/>
-            </w:pPr>
-            <w:r>
-              <w:t xml:space="preserve">Networks</w:t>
+              <w:t xml:space="preserve">Enforcement estate-wide, east-west denied by default, 90-day ADM re-run closing the loop</w:t>
             </w:r>
           </w:p>
         </w:tc>
@@ -3445,54 +4293,33 @@
             </w:r>
           </w:p>
         </w:tc>
-      </w:tr>
-      <w:tr>
-        <w:tc>
-          <w:tcPr/>
-          <w:p>
-            <w:pPr>
-              <w:pStyle w:val="Compact"/>
-            </w:pPr>
-            <w:r>
-              <w:t xml:space="preserve">Workload inventory</w:t>
-            </w:r>
-          </w:p>
-        </w:tc>
-        <w:tc>
-          <w:tcPr/>
-          <w:p>
-            <w:pPr>
-              <w:pStyle w:val="Compact"/>
-            </w:pPr>
-            <w:r>
-              <w:t xml:space="preserve">Manage → Inventory</w:t>
-            </w:r>
-          </w:p>
-        </w:tc>
-        <w:tc>
-          <w:tcPr/>
-          <w:p>
-            <w:pPr>
-              <w:pStyle w:val="Compact"/>
-            </w:pPr>
-            <w:r>
-              <w:t xml:space="preserve">Devices, Apps</w:t>
-            </w:r>
-          </w:p>
-        </w:tc>
-        <w:tc>
-          <w:tcPr/>
-          <w:p>
-            <w:pPr>
-              <w:pStyle w:val="Compact"/>
-            </w:pPr>
-            <w:r>
-              <w:t xml:space="preserve">Initial</w:t>
+        <w:tc>
+          <w:tcPr/>
+          <w:p>
+            <w:pPr>
+              <w:pStyle w:val="Compact"/>
+            </w:pPr>
+            <w:r>
+              <w:t xml:space="preserve">Re-run comparison + API audit log</w:t>
             </w:r>
           </w:p>
         </w:tc>
       </w:tr>
     </w:tbl>
+    <w:p>
+      <w:pPr>
+        <w:pStyle w:val="BodyText"/>
+      </w:pPr>
+      <w:r>
+        <w:t xml:space="preserve">Workspace snapshots and the Denied Connections log are the two artifacts an</w:t>
+      </w:r>
+      <w:r>
+        <w:t xml:space="preserve"> </w:t>
+      </w:r>
+      <w:r>
+        <w:t xml:space="preserve">assessor will ask for when the agency claims Advanced or better.</w:t>
+      </w:r>
+    </w:p>
     <w:p>
       <w:r>
         <w:pict>
@@ -3500,14 +4327,194 @@
         </w:pict>
       </w:r>
     </w:p>
-    <w:bookmarkEnd w:id="31"/>
-    <w:bookmarkStart w:id="32" w:name="X35d93abd157b01bf6bc8b0f567b5acc2eced7e2"/>
+    <w:bookmarkEnd w:id="33"/>
+    <w:bookmarkEnd w:id="34"/>
+    <w:bookmarkStart w:id="38" w:name="Xda809ab06a8a0796e52e9ae06ef465bdc242245"/>
     <w:p>
       <w:pPr>
         <w:pStyle w:val="Heading2"/>
       </w:pPr>
       <w:r>
-        <w:t xml:space="preserve">8. ZTMM Scorecard Template</w:t>
+        <w:t xml:space="preserve">8. CSW Deployment Phases for ZTMM</w:t>
+      </w:r>
+    </w:p>
+    <w:bookmarkStart w:id="35" w:name="X320850d673eb1862e15d344ae17772c49b29613"/>
+    <w:p>
+      <w:pPr>
+        <w:pStyle w:val="Heading3"/>
+      </w:pPr>
+      <w:r>
+        <w:t xml:space="preserve">Phase 1 — Establish Visibility (Traditional → Initial)</w:t>
+      </w:r>
+    </w:p>
+    <w:p>
+      <w:pPr>
+        <w:pStyle w:val="SourceCode"/>
+      </w:pPr>
+      <w:r>
+        <w:rPr>
+          <w:rStyle w:val="VerbatimChar"/>
+        </w:rPr>
+        <w:t xml:space="preserve">Week 1-2:   Deploy sensors (on-prem + cloud connectors)</w:t>
+      </w:r>
+      <w:r>
+        <w:br/>
+      </w:r>
+      <w:r>
+        <w:rPr>
+          <w:rStyle w:val="VerbatimChar"/>
+        </w:rPr>
+        <w:t xml:space="preserve">Week 3-4:   Run ADM — generate traffic baseline</w:t>
+      </w:r>
+      <w:r>
+        <w:br/>
+      </w:r>
+      <w:r>
+        <w:rPr>
+          <w:rStyle w:val="VerbatimChar"/>
+        </w:rPr>
+        <w:t xml:space="preserve">Week 4:     Define scope hierarchy</w:t>
+      </w:r>
+      <w:r>
+        <w:br/>
+      </w:r>
+      <w:r>
+        <w:rPr>
+          <w:rStyle w:val="VerbatimChar"/>
+        </w:rPr>
+        <w:t xml:space="preserve">Week 4:     Enable flow telemetry retention (12 months)</w:t>
+      </w:r>
+    </w:p>
+    <w:bookmarkEnd w:id="35"/>
+    <w:bookmarkStart w:id="36" w:name="Xcd581552ac7ae0a426619c48d97ef5610a60dc3"/>
+    <w:p>
+      <w:pPr>
+        <w:pStyle w:val="Heading3"/>
+      </w:pPr>
+      <w:r>
+        <w:t xml:space="preserve">Phase 2 — Enforce Least Privilege (Initial → Advanced)</w:t>
+      </w:r>
+    </w:p>
+    <w:p>
+      <w:pPr>
+        <w:pStyle w:val="SourceCode"/>
+      </w:pPr>
+      <w:r>
+        <w:rPr>
+          <w:rStyle w:val="VerbatimChar"/>
+        </w:rPr>
+        <w:t xml:space="preserve">Week 5-6:   Build allowlist policies from ADM</w:t>
+      </w:r>
+      <w:r>
+        <w:br/>
+      </w:r>
+      <w:r>
+        <w:rPr>
+          <w:rStyle w:val="VerbatimChar"/>
+        </w:rPr>
+        <w:t xml:space="preserve">Week 7-8:   Simulation mode — validate no false positives</w:t>
+      </w:r>
+      <w:r>
+        <w:br/>
+      </w:r>
+      <w:r>
+        <w:rPr>
+          <w:rStyle w:val="VerbatimChar"/>
+        </w:rPr>
+        <w:t xml:space="preserve">Week 9-10:  Enforcement mode — sensitive scopes first</w:t>
+      </w:r>
+      <w:r>
+        <w:br/>
+      </w:r>
+      <w:r>
+        <w:rPr>
+          <w:rStyle w:val="VerbatimChar"/>
+        </w:rPr>
+        <w:t xml:space="preserve">Week 11-12: Encryption enforcement; block non-compliant protocols</w:t>
+      </w:r>
+      <w:r>
+        <w:br/>
+      </w:r>
+      <w:r>
+        <w:rPr>
+          <w:rStyle w:val="VerbatimChar"/>
+        </w:rPr>
+        <w:t xml:space="preserve">Week 12:    Full alerting and SIEM integration</w:t>
+      </w:r>
+    </w:p>
+    <w:bookmarkEnd w:id="36"/>
+    <w:bookmarkStart w:id="37" w:name="X759d3fe46fb04cf24fa67a13951d1e535f197b3"/>
+    <w:p>
+      <w:pPr>
+        <w:pStyle w:val="Heading3"/>
+      </w:pPr>
+      <w:r>
+        <w:t xml:space="preserve">Phase 3 — Continuous Validation (Advanced → Optimal)</w:t>
+      </w:r>
+    </w:p>
+    <w:p>
+      <w:pPr>
+        <w:pStyle w:val="SourceCode"/>
+      </w:pPr>
+      <w:r>
+        <w:rPr>
+          <w:rStyle w:val="VerbatimChar"/>
+        </w:rPr>
+        <w:t xml:space="preserve">Month 4+:   90-day ADM re-run cycles</w:t>
+      </w:r>
+      <w:r>
+        <w:br/>
+      </w:r>
+      <w:r>
+        <w:rPr>
+          <w:rStyle w:val="VerbatimChar"/>
+        </w:rPr>
+        <w:t xml:space="preserve">Month 4+:   Vulnerability-triggered policy review</w:t>
+      </w:r>
+      <w:r>
+        <w:br/>
+      </w:r>
+      <w:r>
+        <w:rPr>
+          <w:rStyle w:val="VerbatimChar"/>
+        </w:rPr>
+        <w:t xml:space="preserve">Month 6+:   API integration with SOAR</w:t>
+      </w:r>
+      <w:r>
+        <w:br/>
+      </w:r>
+      <w:r>
+        <w:rPr>
+          <w:rStyle w:val="VerbatimChar"/>
+        </w:rPr>
+        <w:t xml:space="preserve">Month 6+:   Automated policy tightening on critical CVEs</w:t>
+      </w:r>
+      <w:r>
+        <w:br/>
+      </w:r>
+      <w:r>
+        <w:rPr>
+          <w:rStyle w:val="VerbatimChar"/>
+        </w:rPr>
+        <w:t xml:space="preserve">Ongoing:    Maturity assessment vs ZTMM scorecard</w:t>
+      </w:r>
+    </w:p>
+    <w:p>
+      <w:r>
+        <w:pict>
+          <v:rect style="width:0;height:1.5pt" o:hralign="center" o:hrstd="t" o:hr="t"/>
+        </w:pict>
+      </w:r>
+    </w:p>
+    <w:bookmarkEnd w:id="37"/>
+    <w:bookmarkEnd w:id="38"/>
+    <w:bookmarkStart w:id="39" w:name="Xec918d872df458dd0f7d8332d97e4c69270e951"/>
+    <w:p>
+      <w:pPr>
+        <w:pStyle w:val="Heading2"/>
+      </w:pPr>
+      <w:r>
+        <w:t xml:space="preserve">9. ZTMM Assessment Evidence Package</w:t>
       </w:r>
     </w:p>
     <w:tbl>
@@ -3533,40 +4540,40 @@
               <w:pStyle w:val="Compact"/>
             </w:pPr>
             <w:r>
-              <w:t xml:space="preserve">Pillar</w:t>
-            </w:r>
-          </w:p>
-        </w:tc>
-        <w:tc>
-          <w:tcPr/>
-          <w:p>
-            <w:pPr>
-              <w:pStyle w:val="Compact"/>
-            </w:pPr>
-            <w:r>
-              <w:t xml:space="preserve">Current Stage</w:t>
-            </w:r>
-          </w:p>
-        </w:tc>
-        <w:tc>
-          <w:tcPr/>
-          <w:p>
-            <w:pPr>
-              <w:pStyle w:val="Compact"/>
-            </w:pPr>
-            <w:r>
-              <w:t xml:space="preserve">Target Stage</w:t>
-            </w:r>
-          </w:p>
-        </w:tc>
-        <w:tc>
-          <w:tcPr/>
-          <w:p>
-            <w:pPr>
-              <w:pStyle w:val="Compact"/>
-            </w:pPr>
-            <w:r>
-              <w:t xml:space="preserve">CSW Actions Required</w:t>
+              <w:t xml:space="preserve">Evidence Item</w:t>
+            </w:r>
+          </w:p>
+        </w:tc>
+        <w:tc>
+          <w:tcPr/>
+          <w:p>
+            <w:pPr>
+              <w:pStyle w:val="Compact"/>
+            </w:pPr>
+            <w:r>
+              <w:t xml:space="preserve">CSW Source</w:t>
+            </w:r>
+          </w:p>
+        </w:tc>
+        <w:tc>
+          <w:tcPr/>
+          <w:p>
+            <w:pPr>
+              <w:pStyle w:val="Compact"/>
+            </w:pPr>
+            <w:r>
+              <w:t xml:space="preserve">ZTMM Pillar</w:t>
+            </w:r>
+          </w:p>
+        </w:tc>
+        <w:tc>
+          <w:tcPr/>
+          <w:p>
+            <w:pPr>
+              <w:pStyle w:val="Compact"/>
+            </w:pPr>
+            <w:r>
+              <w:t xml:space="preserve">Maturity Stage</w:t>
             </w:r>
           </w:p>
         </w:tc>
@@ -3579,40 +4586,40 @@
               <w:pStyle w:val="Compact"/>
             </w:pPr>
             <w:r>
-              <w:t xml:space="preserve">Identity</w:t>
-            </w:r>
-          </w:p>
-        </w:tc>
-        <w:tc>
-          <w:tcPr/>
-          <w:p>
-            <w:pPr>
-              <w:pStyle w:val="Compact"/>
-            </w:pPr>
-            <w:r>
-              <w:t xml:space="preserve">Traditional</w:t>
-            </w:r>
-          </w:p>
-        </w:tc>
-        <w:tc>
-          <w:tcPr/>
-          <w:p>
-            <w:pPr>
-              <w:pStyle w:val="Compact"/>
-            </w:pPr>
-            <w:r>
-              <w:t xml:space="preserve">Advanced</w:t>
-            </w:r>
-          </w:p>
-        </w:tc>
-        <w:tc>
-          <w:tcPr/>
-          <w:p>
-            <w:pPr>
-              <w:pStyle w:val="Compact"/>
-            </w:pPr>
-            <w:r>
-              <w:t xml:space="preserve">Enforce identity-verified access paths via CSW</w:t>
+              <w:t xml:space="preserve">ADM traffic baseline</w:t>
+            </w:r>
+          </w:p>
+        </w:tc>
+        <w:tc>
+          <w:tcPr/>
+          <w:p>
+            <w:pPr>
+              <w:pStyle w:val="Compact"/>
+            </w:pPr>
+            <w:r>
+              <w:t xml:space="preserve">Investigate → ADM</w:t>
+            </w:r>
+          </w:p>
+        </w:tc>
+        <w:tc>
+          <w:tcPr/>
+          <w:p>
+            <w:pPr>
+              <w:pStyle w:val="Compact"/>
+            </w:pPr>
+            <w:r>
+              <w:t xml:space="preserve">Networks, Apps</w:t>
+            </w:r>
+          </w:p>
+        </w:tc>
+        <w:tc>
+          <w:tcPr/>
+          <w:p>
+            <w:pPr>
+              <w:pStyle w:val="Compact"/>
+            </w:pPr>
+            <w:r>
+              <w:t xml:space="preserve">Initial</w:t>
             </w:r>
           </w:p>
         </w:tc>
@@ -3625,18 +4632,29 @@
               <w:pStyle w:val="Compact"/>
             </w:pPr>
             <w:r>
-              <w:t xml:space="preserve">Devices</w:t>
-            </w:r>
-          </w:p>
-        </w:tc>
-        <w:tc>
-          <w:tcPr/>
-          <w:p>
-            <w:pPr>
-              <w:pStyle w:val="Compact"/>
-            </w:pPr>
-            <w:r>
-              <w:t xml:space="preserve">Initial</w:t>
+              <w:t xml:space="preserve">Enforcement policy export</w:t>
+            </w:r>
+          </w:p>
+        </w:tc>
+        <w:tc>
+          <w:tcPr/>
+          <w:p>
+            <w:pPr>
+              <w:pStyle w:val="Compact"/>
+            </w:pPr>
+            <w:r>
+              <w:t xml:space="preserve">Defend → Policy Workspaces</w:t>
+            </w:r>
+          </w:p>
+        </w:tc>
+        <w:tc>
+          <w:tcPr/>
+          <w:p>
+            <w:pPr>
+              <w:pStyle w:val="Compact"/>
+            </w:pPr>
+            <w:r>
+              <w:t xml:space="preserve">Networks, Apps</w:t>
             </w:r>
           </w:p>
         </w:tc>
@@ -3648,17 +4666,6 @@
             </w:pPr>
             <w:r>
               <w:t xml:space="preserve">Advanced</w:t>
-            </w:r>
-          </w:p>
-        </w:tc>
-        <w:tc>
-          <w:tcPr/>
-          <w:p>
-            <w:pPr>
-              <w:pStyle w:val="Compact"/>
-            </w:pPr>
-            <w:r>
-              <w:t xml:space="preserve">Process-level workload fingerprinting; anomaly detection</w:t>
             </w:r>
           </w:p>
         </w:tc>
@@ -3671,40 +4678,40 @@
               <w:pStyle w:val="Compact"/>
             </w:pPr>
             <w:r>
-              <w:t xml:space="preserve">Networks</w:t>
-            </w:r>
-          </w:p>
-        </w:tc>
-        <w:tc>
-          <w:tcPr/>
-          <w:p>
-            <w:pPr>
-              <w:pStyle w:val="Compact"/>
-            </w:pPr>
-            <w:r>
-              <w:t xml:space="preserve">Initial</w:t>
-            </w:r>
-          </w:p>
-        </w:tc>
-        <w:tc>
-          <w:tcPr/>
-          <w:p>
-            <w:pPr>
-              <w:pStyle w:val="Compact"/>
-            </w:pPr>
-            <w:r>
-              <w:t xml:space="preserve">Optimal</w:t>
-            </w:r>
-          </w:p>
-        </w:tc>
-        <w:tc>
-          <w:tcPr/>
-          <w:p>
-            <w:pPr>
-              <w:pStyle w:val="Compact"/>
-            </w:pPr>
-            <w:r>
-              <w:t xml:space="preserve">Full enforcement; encryption; continuous ADM</w:t>
+              <w:t xml:space="preserve">Encryption compliance report</w:t>
+            </w:r>
+          </w:p>
+        </w:tc>
+        <w:tc>
+          <w:tcPr/>
+          <w:p>
+            <w:pPr>
+              <w:pStyle w:val="Compact"/>
+            </w:pPr>
+            <w:r>
+              <w:t xml:space="preserve">Flow Search (protocol filter)</w:t>
+            </w:r>
+          </w:p>
+        </w:tc>
+        <w:tc>
+          <w:tcPr/>
+          <w:p>
+            <w:pPr>
+              <w:pStyle w:val="Compact"/>
+            </w:pPr>
+            <w:r>
+              <w:t xml:space="preserve">Networks, Data</w:t>
+            </w:r>
+          </w:p>
+        </w:tc>
+        <w:tc>
+          <w:tcPr/>
+          <w:p>
+            <w:pPr>
+              <w:pStyle w:val="Compact"/>
+            </w:pPr>
+            <w:r>
+              <w:t xml:space="preserve">Advanced</w:t>
             </w:r>
           </w:p>
         </w:tc>
@@ -3717,18 +4724,29 @@
               <w:pStyle w:val="Compact"/>
             </w:pPr>
             <w:r>
-              <w:t xml:space="preserve">Applications</w:t>
-            </w:r>
-          </w:p>
-        </w:tc>
-        <w:tc>
-          <w:tcPr/>
-          <w:p>
-            <w:pPr>
-              <w:pStyle w:val="Compact"/>
-            </w:pPr>
-            <w:r>
-              <w:t xml:space="preserve">Traditional</w:t>
+              <w:t xml:space="preserve">Anomaly detection log</w:t>
+            </w:r>
+          </w:p>
+        </w:tc>
+        <w:tc>
+          <w:tcPr/>
+          <w:p>
+            <w:pPr>
+              <w:pStyle w:val="Compact"/>
+            </w:pPr>
+            <w:r>
+              <w:t xml:space="preserve">Alerts → Dashboard</w:t>
+            </w:r>
+          </w:p>
+        </w:tc>
+        <w:tc>
+          <w:tcPr/>
+          <w:p>
+            <w:pPr>
+              <w:pStyle w:val="Compact"/>
+            </w:pPr>
+            <w:r>
+              <w:t xml:space="preserve">Networks</w:t>
             </w:r>
           </w:p>
         </w:tc>
@@ -3740,17 +4758,6 @@
             </w:pPr>
             <w:r>
               <w:t xml:space="preserve">Advanced</w:t>
-            </w:r>
-          </w:p>
-        </w:tc>
-        <w:tc>
-          <w:tcPr/>
-          <w:p>
-            <w:pPr>
-              <w:pStyle w:val="Compact"/>
-            </w:pPr>
-            <w:r>
-              <w:t xml:space="preserve">Workload-level policy; vulnerability management</w:t>
             </w:r>
           </w:p>
         </w:tc>
@@ -3763,18 +4770,29 @@
               <w:pStyle w:val="Compact"/>
             </w:pPr>
             <w:r>
-              <w:t xml:space="preserve">Data</w:t>
-            </w:r>
-          </w:p>
-        </w:tc>
-        <w:tc>
-          <w:tcPr/>
-          <w:p>
-            <w:pPr>
-              <w:pStyle w:val="Compact"/>
-            </w:pPr>
-            <w:r>
-              <w:t xml:space="preserve">Traditional</w:t>
+              <w:t xml:space="preserve">Vulnerability report</w:t>
+            </w:r>
+          </w:p>
+        </w:tc>
+        <w:tc>
+          <w:tcPr/>
+          <w:p>
+            <w:pPr>
+              <w:pStyle w:val="Compact"/>
+            </w:pPr>
+            <w:r>
+              <w:t xml:space="preserve">Investigate → Vulnerability</w:t>
+            </w:r>
+          </w:p>
+        </w:tc>
+        <w:tc>
+          <w:tcPr/>
+          <w:p>
+            <w:pPr>
+              <w:pStyle w:val="Compact"/>
+            </w:pPr>
+            <w:r>
+              <w:t xml:space="preserve">Apps</w:t>
             </w:r>
           </w:p>
         </w:tc>
@@ -3789,14 +4807,141 @@
             </w:r>
           </w:p>
         </w:tc>
-        <w:tc>
-          <w:tcPr/>
-          <w:p>
-            <w:pPr>
-              <w:pStyle w:val="Compact"/>
-            </w:pPr>
-            <w:r>
-              <w:t xml:space="preserve">Data flow visibility; encryption enforcement</w:t>
+      </w:tr>
+      <w:tr>
+        <w:tc>
+          <w:tcPr/>
+          <w:p>
+            <w:pPr>
+              <w:pStyle w:val="Compact"/>
+            </w:pPr>
+            <w:r>
+              <w:t xml:space="preserve">Continuous ADM comparison</w:t>
+            </w:r>
+          </w:p>
+        </w:tc>
+        <w:tc>
+          <w:tcPr/>
+          <w:p>
+            <w:pPr>
+              <w:pStyle w:val="Compact"/>
+            </w:pPr>
+            <w:r>
+              <w:t xml:space="preserve">ADM re-run vs baseline</w:t>
+            </w:r>
+          </w:p>
+        </w:tc>
+        <w:tc>
+          <w:tcPr/>
+          <w:p>
+            <w:pPr>
+              <w:pStyle w:val="Compact"/>
+            </w:pPr>
+            <w:r>
+              <w:t xml:space="preserve">Networks, Apps</w:t>
+            </w:r>
+          </w:p>
+        </w:tc>
+        <w:tc>
+          <w:tcPr/>
+          <w:p>
+            <w:pPr>
+              <w:pStyle w:val="Compact"/>
+            </w:pPr>
+            <w:r>
+              <w:t xml:space="preserve">Optimal</w:t>
+            </w:r>
+          </w:p>
+        </w:tc>
+      </w:tr>
+      <w:tr>
+        <w:tc>
+          <w:tcPr/>
+          <w:p>
+            <w:pPr>
+              <w:pStyle w:val="Compact"/>
+            </w:pPr>
+            <w:r>
+              <w:t xml:space="preserve">API policy automation evidence</w:t>
+            </w:r>
+          </w:p>
+        </w:tc>
+        <w:tc>
+          <w:tcPr/>
+          <w:p>
+            <w:pPr>
+              <w:pStyle w:val="Compact"/>
+            </w:pPr>
+            <w:r>
+              <w:t xml:space="preserve">CSW API audit log</w:t>
+            </w:r>
+          </w:p>
+        </w:tc>
+        <w:tc>
+          <w:tcPr/>
+          <w:p>
+            <w:pPr>
+              <w:pStyle w:val="Compact"/>
+            </w:pPr>
+            <w:r>
+              <w:t xml:space="preserve">Networks</w:t>
+            </w:r>
+          </w:p>
+        </w:tc>
+        <w:tc>
+          <w:tcPr/>
+          <w:p>
+            <w:pPr>
+              <w:pStyle w:val="Compact"/>
+            </w:pPr>
+            <w:r>
+              <w:t xml:space="preserve">Optimal</w:t>
+            </w:r>
+          </w:p>
+        </w:tc>
+      </w:tr>
+      <w:tr>
+        <w:tc>
+          <w:tcPr/>
+          <w:p>
+            <w:pPr>
+              <w:pStyle w:val="Compact"/>
+            </w:pPr>
+            <w:r>
+              <w:t xml:space="preserve">Workload inventory</w:t>
+            </w:r>
+          </w:p>
+        </w:tc>
+        <w:tc>
+          <w:tcPr/>
+          <w:p>
+            <w:pPr>
+              <w:pStyle w:val="Compact"/>
+            </w:pPr>
+            <w:r>
+              <w:t xml:space="preserve">Manage → Inventory</w:t>
+            </w:r>
+          </w:p>
+        </w:tc>
+        <w:tc>
+          <w:tcPr/>
+          <w:p>
+            <w:pPr>
+              <w:pStyle w:val="Compact"/>
+            </w:pPr>
+            <w:r>
+              <w:t xml:space="preserve">Devices, Apps</w:t>
+            </w:r>
+          </w:p>
+        </w:tc>
+        <w:tc>
+          <w:tcPr/>
+          <w:p>
+            <w:pPr>
+              <w:pStyle w:val="Compact"/>
+            </w:pPr>
+            <w:r>
+              <w:t xml:space="preserve">Initial</w:t>
             </w:r>
           </w:p>
         </w:tc>
@@ -3809,8 +4954,317 @@
         </w:pict>
       </w:r>
     </w:p>
-    <w:bookmarkEnd w:id="32"/>
-    <w:bookmarkStart w:id="36" w:name="related-frameworks"/>
+    <w:bookmarkEnd w:id="39"/>
+    <w:bookmarkStart w:id="40" w:name="Xeee7ca66af966cc3e648da6aec8ab632979275b"/>
+    <w:p>
+      <w:pPr>
+        <w:pStyle w:val="Heading2"/>
+      </w:pPr>
+      <w:r>
+        <w:t xml:space="preserve">10. ZTMM Scorecard Template</w:t>
+      </w:r>
+    </w:p>
+    <w:tbl>
+      <w:tblPr>
+        <w:tblStyle w:val="Table"/>
+        <w:tblW w:type="auto" w:w="0"/>
+        <w:tblLook w:firstRow="1" w:lastRow="0" w:firstColumn="0" w:lastColumn="0" w:noHBand="0" w:noVBand="0" w:val="0020"/>
+      </w:tblPr>
+      <w:tblGrid>
+        <w:gridCol w:w="1980"/>
+        <w:gridCol w:w="1980"/>
+        <w:gridCol w:w="1980"/>
+        <w:gridCol w:w="1980"/>
+      </w:tblGrid>
+      <w:tr>
+        <w:trPr>
+          <w:tblHeader w:val="on"/>
+        </w:trPr>
+        <w:tc>
+          <w:tcPr/>
+          <w:p>
+            <w:pPr>
+              <w:pStyle w:val="Compact"/>
+            </w:pPr>
+            <w:r>
+              <w:t xml:space="preserve">Pillar</w:t>
+            </w:r>
+          </w:p>
+        </w:tc>
+        <w:tc>
+          <w:tcPr/>
+          <w:p>
+            <w:pPr>
+              <w:pStyle w:val="Compact"/>
+            </w:pPr>
+            <w:r>
+              <w:t xml:space="preserve">Current Stage</w:t>
+            </w:r>
+          </w:p>
+        </w:tc>
+        <w:tc>
+          <w:tcPr/>
+          <w:p>
+            <w:pPr>
+              <w:pStyle w:val="Compact"/>
+            </w:pPr>
+            <w:r>
+              <w:t xml:space="preserve">Target Stage</w:t>
+            </w:r>
+          </w:p>
+        </w:tc>
+        <w:tc>
+          <w:tcPr/>
+          <w:p>
+            <w:pPr>
+              <w:pStyle w:val="Compact"/>
+            </w:pPr>
+            <w:r>
+              <w:t xml:space="preserve">CSW Actions Required</w:t>
+            </w:r>
+          </w:p>
+        </w:tc>
+      </w:tr>
+      <w:tr>
+        <w:tc>
+          <w:tcPr/>
+          <w:p>
+            <w:pPr>
+              <w:pStyle w:val="Compact"/>
+            </w:pPr>
+            <w:r>
+              <w:t xml:space="preserve">Identity</w:t>
+            </w:r>
+          </w:p>
+        </w:tc>
+        <w:tc>
+          <w:tcPr/>
+          <w:p>
+            <w:pPr>
+              <w:pStyle w:val="Compact"/>
+            </w:pPr>
+            <w:r>
+              <w:t xml:space="preserve">Traditional</w:t>
+            </w:r>
+          </w:p>
+        </w:tc>
+        <w:tc>
+          <w:tcPr/>
+          <w:p>
+            <w:pPr>
+              <w:pStyle w:val="Compact"/>
+            </w:pPr>
+            <w:r>
+              <w:t xml:space="preserve">Advanced</w:t>
+            </w:r>
+          </w:p>
+        </w:tc>
+        <w:tc>
+          <w:tcPr/>
+          <w:p>
+            <w:pPr>
+              <w:pStyle w:val="Compact"/>
+            </w:pPr>
+            <w:r>
+              <w:t xml:space="preserve">Enforce identity-verified access paths via CSW</w:t>
+            </w:r>
+          </w:p>
+        </w:tc>
+      </w:tr>
+      <w:tr>
+        <w:tc>
+          <w:tcPr/>
+          <w:p>
+            <w:pPr>
+              <w:pStyle w:val="Compact"/>
+            </w:pPr>
+            <w:r>
+              <w:t xml:space="preserve">Devices</w:t>
+            </w:r>
+          </w:p>
+        </w:tc>
+        <w:tc>
+          <w:tcPr/>
+          <w:p>
+            <w:pPr>
+              <w:pStyle w:val="Compact"/>
+            </w:pPr>
+            <w:r>
+              <w:t xml:space="preserve">Initial</w:t>
+            </w:r>
+          </w:p>
+        </w:tc>
+        <w:tc>
+          <w:tcPr/>
+          <w:p>
+            <w:pPr>
+              <w:pStyle w:val="Compact"/>
+            </w:pPr>
+            <w:r>
+              <w:t xml:space="preserve">Advanced</w:t>
+            </w:r>
+          </w:p>
+        </w:tc>
+        <w:tc>
+          <w:tcPr/>
+          <w:p>
+            <w:pPr>
+              <w:pStyle w:val="Compact"/>
+            </w:pPr>
+            <w:r>
+              <w:t xml:space="preserve">Process-level workload fingerprinting; anomaly detection</w:t>
+            </w:r>
+          </w:p>
+        </w:tc>
+      </w:tr>
+      <w:tr>
+        <w:tc>
+          <w:tcPr/>
+          <w:p>
+            <w:pPr>
+              <w:pStyle w:val="Compact"/>
+            </w:pPr>
+            <w:r>
+              <w:t xml:space="preserve">Networks</w:t>
+            </w:r>
+          </w:p>
+        </w:tc>
+        <w:tc>
+          <w:tcPr/>
+          <w:p>
+            <w:pPr>
+              <w:pStyle w:val="Compact"/>
+            </w:pPr>
+            <w:r>
+              <w:t xml:space="preserve">Initial</w:t>
+            </w:r>
+          </w:p>
+        </w:tc>
+        <w:tc>
+          <w:tcPr/>
+          <w:p>
+            <w:pPr>
+              <w:pStyle w:val="Compact"/>
+            </w:pPr>
+            <w:r>
+              <w:t xml:space="preserve">Optimal</w:t>
+            </w:r>
+          </w:p>
+        </w:tc>
+        <w:tc>
+          <w:tcPr/>
+          <w:p>
+            <w:pPr>
+              <w:pStyle w:val="Compact"/>
+            </w:pPr>
+            <w:r>
+              <w:t xml:space="preserve">Full enforcement; encryption; continuous ADM</w:t>
+            </w:r>
+          </w:p>
+        </w:tc>
+      </w:tr>
+      <w:tr>
+        <w:tc>
+          <w:tcPr/>
+          <w:p>
+            <w:pPr>
+              <w:pStyle w:val="Compact"/>
+            </w:pPr>
+            <w:r>
+              <w:t xml:space="preserve">Applications</w:t>
+            </w:r>
+          </w:p>
+        </w:tc>
+        <w:tc>
+          <w:tcPr/>
+          <w:p>
+            <w:pPr>
+              <w:pStyle w:val="Compact"/>
+            </w:pPr>
+            <w:r>
+              <w:t xml:space="preserve">Traditional</w:t>
+            </w:r>
+          </w:p>
+        </w:tc>
+        <w:tc>
+          <w:tcPr/>
+          <w:p>
+            <w:pPr>
+              <w:pStyle w:val="Compact"/>
+            </w:pPr>
+            <w:r>
+              <w:t xml:space="preserve">Advanced</w:t>
+            </w:r>
+          </w:p>
+        </w:tc>
+        <w:tc>
+          <w:tcPr/>
+          <w:p>
+            <w:pPr>
+              <w:pStyle w:val="Compact"/>
+            </w:pPr>
+            <w:r>
+              <w:t xml:space="preserve">Workload-level policy; vulnerability management</w:t>
+            </w:r>
+          </w:p>
+        </w:tc>
+      </w:tr>
+      <w:tr>
+        <w:tc>
+          <w:tcPr/>
+          <w:p>
+            <w:pPr>
+              <w:pStyle w:val="Compact"/>
+            </w:pPr>
+            <w:r>
+              <w:t xml:space="preserve">Data</w:t>
+            </w:r>
+          </w:p>
+        </w:tc>
+        <w:tc>
+          <w:tcPr/>
+          <w:p>
+            <w:pPr>
+              <w:pStyle w:val="Compact"/>
+            </w:pPr>
+            <w:r>
+              <w:t xml:space="preserve">Traditional</w:t>
+            </w:r>
+          </w:p>
+        </w:tc>
+        <w:tc>
+          <w:tcPr/>
+          <w:p>
+            <w:pPr>
+              <w:pStyle w:val="Compact"/>
+            </w:pPr>
+            <w:r>
+              <w:t xml:space="preserve">Advanced</w:t>
+            </w:r>
+          </w:p>
+        </w:tc>
+        <w:tc>
+          <w:tcPr/>
+          <w:p>
+            <w:pPr>
+              <w:pStyle w:val="Compact"/>
+            </w:pPr>
+            <w:r>
+              <w:t xml:space="preserve">Data flow visibility; encryption enforcement</w:t>
+            </w:r>
+          </w:p>
+        </w:tc>
+      </w:tr>
+    </w:tbl>
+    <w:p>
+      <w:r>
+        <w:pict>
+          <v:rect style="width:0;height:1.5pt" o:hralign="center" o:hrstd="t" o:hr="t"/>
+        </w:pict>
+      </w:r>
+    </w:p>
+    <w:bookmarkEnd w:id="40"/>
+    <w:bookmarkStart w:id="44" w:name="related-frameworks"/>
     <w:p>
       <w:pPr>
         <w:pStyle w:val="Heading2"/>
@@ -3827,7 +5281,7 @@
           <w:numId w:val="1020"/>
         </w:numPr>
       </w:pPr>
-      <w:hyperlink r:id="rId33">
+      <w:hyperlink r:id="rId41">
         <w:r>
           <w:rPr>
             <w:rStyle w:val="Hyperlink"/>
@@ -3850,7 +5304,7 @@
           <w:numId w:val="1020"/>
         </w:numPr>
       </w:pPr>
-      <w:hyperlink r:id="rId34">
+      <w:hyperlink r:id="rId42">
         <w:r>
           <w:rPr>
             <w:rStyle w:val="Hyperlink"/>
@@ -3873,7 +5327,7 @@
           <w:numId w:val="1020"/>
         </w:numPr>
       </w:pPr>
-      <w:hyperlink r:id="rId35">
+      <w:hyperlink r:id="rId43">
         <w:r>
           <w:rPr>
             <w:rStyle w:val="Hyperlink"/>
@@ -3907,8 +5361,8 @@
         <w:t xml:space="preserve">Replace [Customer Name] and bracketed fields before customer delivery.</w:t>
       </w:r>
     </w:p>
-    <w:bookmarkEnd w:id="36"/>
-    <w:bookmarkEnd w:id="37"/>
+    <w:bookmarkEnd w:id="44"/>
+    <w:bookmarkEnd w:id="45"/>
     <w:sectPr>
       <w:footnotePr>
         <w:numRestart w:val="eachSect"/>

</xml_diff>